<commit_message>
docs: update user manuals (mu-Clid + mu-Tant) + new mu-link manual; pushed to tester share
Added a 'Connecting to mu-link' section to the mu-Clid + mu-Tant manuals and refreshed
mu-Tant currency (user .wav wavetables, MIDI program-change, gate Arrow/Glue tools +
per-envelope Probability/Loop). New docs/mu-link/create_manual.ps1 -> mu-link User Manual
(audio hub + master clock, device setup, connecting apps, mixer, external MIDI clock sync,
MIDI clock out, troubleshooting). All three .docx regenerated and copied to the OneDrive
tester share under Manuals/.

Co-Authored-By: Claude Opus 4.8 <noreply@anthropic.com>
</commit_message>
<xml_diff>
--- a/docs/mu-clid/mu-Clid User Manual.docx
+++ b/docs/mu-clid/mu-Clid User Manual.docx
@@ -106,6 +106,7 @@
         <w:rPr>
           <w:i/>
         </w:rPr>
+        <w:lastRenderedPageBreak/>
         <w:t>[Screenshot: Diagram: 16 steps with 5 hits distributed evenly, illustrating Bjorklund's algorithm.]</w:t>
       </w:r>
     </w:p>
@@ -288,6 +289,7 @@
         <w:pStyle w:val="ListBullet"/>
       </w:pPr>
       <w:r>
+        <w:lastRenderedPageBreak/>
         <w:t>Master Loop dropdown  —  how many steps the entire pattern runs before looping. Choices range from 16 steps to 512 steps, or infinity (free-running).</w:t>
       </w:r>
     </w:p>
@@ -419,6 +421,7 @@
         <w:pStyle w:val="Heading1"/>
       </w:pPr>
       <w:r>
+        <w:lastRenderedPageBreak/>
         <w:t>8. Rhythm Circle</w:t>
       </w:r>
     </w:p>
@@ -1796,7 +1799,65 @@
         <w:pStyle w:val="Heading1"/>
       </w:pPr>
       <w:r>
-        <w:t>18. Technical Specifications</w:t>
+        <w:t>18. Connecting to mu-link</w:t>
+      </w:r>
+    </w:p>
+    <w:p>
+      <w:r>
+        <w:t>mu-link is a companion application from Transwarp Development Project: a local audio hub and master clock for the mu family. When mu-link is running, the mu-Clid standalone application connects to it automatically — mu-Clid's audio is summed into mu-link's mix and its transport locks to mu-link's master clock. The plug-in versions are unaffected; only the standalone connects, because in a DAW the host already owns the clock and audio device.</w:t>
+      </w:r>
+    </w:p>
+    <w:p>
+      <w:pPr>
+        <w:pStyle w:val="Heading2"/>
+      </w:pPr>
+      <w:r>
+        <w:t>How to Connect</w:t>
+      </w:r>
+    </w:p>
+    <w:p>
+      <w:pPr>
+        <w:pStyle w:val="ListBullet"/>
+      </w:pPr>
+      <w:r>
+        <w:t>Launch mu-link, then launch mu-Clid standalone — in either order. Within about a second the mu-Clid title bar shows 'mu-link connected'.</w:t>
+      </w:r>
+    </w:p>
+    <w:p>
+      <w:pPr>
+        <w:pStyle w:val="ListBullet"/>
+      </w:pPr>
+      <w:r>
+        <w:t>mu-Clid's audio now plays through mu-link's output device, summed with any other connected mu apps. mu-Clid appears as a channel in mu-link's client strip with its own level, pan, mute, and solo.</w:t>
+      </w:r>
+    </w:p>
+    <w:p>
+      <w:pPr>
+        <w:pStyle w:val="ListBullet"/>
+      </w:pPr>
+      <w:r>
+        <w:t>mu-Clid's transport follows mu-link: mu-link is the tempo master, and its Play/Stop and tempo drive mu-Clid. Use mu-link's transport (not mu-Clid's) while connected.</w:t>
+      </w:r>
+    </w:p>
+    <w:p>
+      <w:pPr>
+        <w:pStyle w:val="ListBullet"/>
+      </w:pPr>
+      <w:r>
+        <w:t>Quit mu-link and mu-Clid instantly reverts to its own audio device and internal transport — no restart needed.</w:t>
+      </w:r>
+    </w:p>
+    <w:p>
+      <w:r>
+        <w:t>This lets you run mu-Clid, mu-Tant, and other mu standalones together, perfectly in sync and mixed to a single output — and lets mu-link slave the whole rig to an external MIDI clock from a drum machine or DAW. See the mu-link User Manual for the full picture.</w:t>
+      </w:r>
+    </w:p>
+    <w:p>
+      <w:pPr>
+        <w:pStyle w:val="Heading1"/>
+      </w:pPr>
+      <w:r>
+        <w:t>19. Technical Specifications</w:t>
       </w:r>
     </w:p>
     <w:p>
@@ -1923,7 +1984,7 @@
   <w:abstractNum w:abstractNumId="0" w15:restartNumberingAfterBreak="0">
     <w:nsid w:val="FFFFFF89"/>
     <w:multiLevelType w:val="singleLevel"/>
-    <w:tmpl w:val="4F18E538"/>
+    <w:tmpl w:val="F132AC00"/>
     <w:lvl w:ilvl="0">
       <w:start w:val="1"/>
       <w:numFmt w:val="bullet"/>
@@ -1941,7 +2002,7 @@
       </w:rPr>
     </w:lvl>
   </w:abstractNum>
-  <w:num w:numId="1" w16cid:durableId="1558783792">
+  <w:num w:numId="1" w16cid:durableId="1888370464">
     <w:abstractNumId w:val="0"/>
   </w:num>
 </w:numbering>
@@ -2355,7 +2416,7 @@
     <w:link w:val="Heading1Char"/>
     <w:uiPriority w:val="9"/>
     <w:qFormat/>
-    <w:rsid w:val="00226699"/>
+    <w:rsid w:val="003D2706"/>
     <w:pPr>
       <w:keepNext/>
       <w:keepLines/>
@@ -2377,7 +2438,7 @@
     <w:uiPriority w:val="9"/>
     <w:unhideWhenUsed/>
     <w:qFormat/>
-    <w:rsid w:val="00226699"/>
+    <w:rsid w:val="003D2706"/>
     <w:pPr>
       <w:keepNext/>
       <w:keepLines/>
@@ -2399,7 +2460,7 @@
     <w:uiPriority w:val="9"/>
     <w:unhideWhenUsed/>
     <w:qFormat/>
-    <w:rsid w:val="00226699"/>
+    <w:rsid w:val="003D2706"/>
     <w:pPr>
       <w:keepNext/>
       <w:keepLines/>
@@ -2422,7 +2483,7 @@
     <w:semiHidden/>
     <w:unhideWhenUsed/>
     <w:qFormat/>
-    <w:rsid w:val="00226699"/>
+    <w:rsid w:val="003D2706"/>
     <w:pPr>
       <w:keepNext/>
       <w:keepLines/>
@@ -2445,7 +2506,7 @@
     <w:semiHidden/>
     <w:unhideWhenUsed/>
     <w:qFormat/>
-    <w:rsid w:val="00226699"/>
+    <w:rsid w:val="003D2706"/>
     <w:pPr>
       <w:keepNext/>
       <w:keepLines/>
@@ -2466,7 +2527,7 @@
     <w:semiHidden/>
     <w:unhideWhenUsed/>
     <w:qFormat/>
-    <w:rsid w:val="00226699"/>
+    <w:rsid w:val="003D2706"/>
     <w:pPr>
       <w:keepNext/>
       <w:keepLines/>
@@ -2489,7 +2550,7 @@
     <w:semiHidden/>
     <w:unhideWhenUsed/>
     <w:qFormat/>
-    <w:rsid w:val="00226699"/>
+    <w:rsid w:val="003D2706"/>
     <w:pPr>
       <w:keepNext/>
       <w:keepLines/>
@@ -2510,7 +2571,7 @@
     <w:semiHidden/>
     <w:unhideWhenUsed/>
     <w:qFormat/>
-    <w:rsid w:val="00226699"/>
+    <w:rsid w:val="003D2706"/>
     <w:pPr>
       <w:keepNext/>
       <w:keepLines/>
@@ -2533,7 +2594,7 @@
     <w:semiHidden/>
     <w:unhideWhenUsed/>
     <w:qFormat/>
-    <w:rsid w:val="00226699"/>
+    <w:rsid w:val="003D2706"/>
     <w:pPr>
       <w:keepNext/>
       <w:keepLines/>
@@ -2577,7 +2638,7 @@
     <w:basedOn w:val="DefaultParagraphFont"/>
     <w:link w:val="Heading1"/>
     <w:uiPriority w:val="9"/>
-    <w:rsid w:val="00226699"/>
+    <w:rsid w:val="003D2706"/>
     <w:rPr>
       <w:rFonts w:asciiTheme="majorHAnsi" w:eastAsiaTheme="majorEastAsia" w:hAnsiTheme="majorHAnsi" w:cstheme="majorBidi"/>
       <w:color w:val="0F4761" w:themeColor="accent1" w:themeShade="BF"/>
@@ -2590,7 +2651,7 @@
     <w:basedOn w:val="DefaultParagraphFont"/>
     <w:link w:val="Heading2"/>
     <w:uiPriority w:val="9"/>
-    <w:rsid w:val="00226699"/>
+    <w:rsid w:val="003D2706"/>
     <w:rPr>
       <w:rFonts w:asciiTheme="majorHAnsi" w:eastAsiaTheme="majorEastAsia" w:hAnsiTheme="majorHAnsi" w:cstheme="majorBidi"/>
       <w:color w:val="0F4761" w:themeColor="accent1" w:themeShade="BF"/>
@@ -2603,7 +2664,7 @@
     <w:basedOn w:val="DefaultParagraphFont"/>
     <w:link w:val="Heading3"/>
     <w:uiPriority w:val="9"/>
-    <w:rsid w:val="00226699"/>
+    <w:rsid w:val="003D2706"/>
     <w:rPr>
       <w:rFonts w:eastAsiaTheme="majorEastAsia" w:cstheme="majorBidi"/>
       <w:color w:val="0F4761" w:themeColor="accent1" w:themeShade="BF"/>
@@ -2617,7 +2678,7 @@
     <w:link w:val="Heading4"/>
     <w:uiPriority w:val="9"/>
     <w:semiHidden/>
-    <w:rsid w:val="00226699"/>
+    <w:rsid w:val="003D2706"/>
     <w:rPr>
       <w:rFonts w:eastAsiaTheme="majorEastAsia" w:cstheme="majorBidi"/>
       <w:i/>
@@ -2631,7 +2692,7 @@
     <w:link w:val="Heading5"/>
     <w:uiPriority w:val="9"/>
     <w:semiHidden/>
-    <w:rsid w:val="00226699"/>
+    <w:rsid w:val="003D2706"/>
     <w:rPr>
       <w:rFonts w:eastAsiaTheme="majorEastAsia" w:cstheme="majorBidi"/>
       <w:color w:val="0F4761" w:themeColor="accent1" w:themeShade="BF"/>
@@ -2643,7 +2704,7 @@
     <w:link w:val="Heading6"/>
     <w:uiPriority w:val="9"/>
     <w:semiHidden/>
-    <w:rsid w:val="00226699"/>
+    <w:rsid w:val="003D2706"/>
     <w:rPr>
       <w:rFonts w:eastAsiaTheme="majorEastAsia" w:cstheme="majorBidi"/>
       <w:i/>
@@ -2657,7 +2718,7 @@
     <w:link w:val="Heading7"/>
     <w:uiPriority w:val="9"/>
     <w:semiHidden/>
-    <w:rsid w:val="00226699"/>
+    <w:rsid w:val="003D2706"/>
     <w:rPr>
       <w:rFonts w:eastAsiaTheme="majorEastAsia" w:cstheme="majorBidi"/>
       <w:color w:val="595959" w:themeColor="text1" w:themeTint="A6"/>
@@ -2669,7 +2730,7 @@
     <w:link w:val="Heading8"/>
     <w:uiPriority w:val="9"/>
     <w:semiHidden/>
-    <w:rsid w:val="00226699"/>
+    <w:rsid w:val="003D2706"/>
     <w:rPr>
       <w:rFonts w:eastAsiaTheme="majorEastAsia" w:cstheme="majorBidi"/>
       <w:i/>
@@ -2683,7 +2744,7 @@
     <w:link w:val="Heading9"/>
     <w:uiPriority w:val="9"/>
     <w:semiHidden/>
-    <w:rsid w:val="00226699"/>
+    <w:rsid w:val="003D2706"/>
     <w:rPr>
       <w:rFonts w:eastAsiaTheme="majorEastAsia" w:cstheme="majorBidi"/>
       <w:color w:val="272727" w:themeColor="text1" w:themeTint="D8"/>
@@ -2696,7 +2757,7 @@
     <w:link w:val="TitleChar"/>
     <w:uiPriority w:val="10"/>
     <w:qFormat/>
-    <w:rsid w:val="00226699"/>
+    <w:rsid w:val="003D2706"/>
     <w:pPr>
       <w:spacing w:after="80" w:line="240" w:lineRule="auto"/>
       <w:contextualSpacing/>
@@ -2714,7 +2775,7 @@
     <w:basedOn w:val="DefaultParagraphFont"/>
     <w:link w:val="Title"/>
     <w:uiPriority w:val="10"/>
-    <w:rsid w:val="00226699"/>
+    <w:rsid w:val="003D2706"/>
     <w:rPr>
       <w:rFonts w:asciiTheme="majorHAnsi" w:eastAsiaTheme="majorEastAsia" w:hAnsiTheme="majorHAnsi" w:cstheme="majorBidi"/>
       <w:spacing w:val="-10"/>
@@ -2730,7 +2791,7 @@
     <w:link w:val="SubtitleChar"/>
     <w:uiPriority w:val="11"/>
     <w:qFormat/>
-    <w:rsid w:val="00226699"/>
+    <w:rsid w:val="003D2706"/>
     <w:pPr>
       <w:numPr>
         <w:ilvl w:val="1"/>
@@ -2749,7 +2810,7 @@
     <w:basedOn w:val="DefaultParagraphFont"/>
     <w:link w:val="Subtitle"/>
     <w:uiPriority w:val="11"/>
-    <w:rsid w:val="00226699"/>
+    <w:rsid w:val="003D2706"/>
     <w:rPr>
       <w:rFonts w:eastAsiaTheme="majorEastAsia" w:cstheme="majorBidi"/>
       <w:color w:val="595959" w:themeColor="text1" w:themeTint="A6"/>
@@ -2765,7 +2826,7 @@
     <w:link w:val="QuoteChar"/>
     <w:uiPriority w:val="29"/>
     <w:qFormat/>
-    <w:rsid w:val="00226699"/>
+    <w:rsid w:val="003D2706"/>
     <w:pPr>
       <w:spacing w:before="160"/>
       <w:jc w:val="center"/>
@@ -2781,7 +2842,7 @@
     <w:basedOn w:val="DefaultParagraphFont"/>
     <w:link w:val="Quote"/>
     <w:uiPriority w:val="29"/>
-    <w:rsid w:val="00226699"/>
+    <w:rsid w:val="003D2706"/>
     <w:rPr>
       <w:i/>
       <w:iCs/>
@@ -2793,7 +2854,7 @@
     <w:basedOn w:val="Normal"/>
     <w:uiPriority w:val="34"/>
     <w:qFormat/>
-    <w:rsid w:val="00226699"/>
+    <w:rsid w:val="003D2706"/>
     <w:pPr>
       <w:ind w:left="720"/>
       <w:contextualSpacing/>
@@ -2804,7 +2865,7 @@
     <w:basedOn w:val="DefaultParagraphFont"/>
     <w:uiPriority w:val="21"/>
     <w:qFormat/>
-    <w:rsid w:val="00226699"/>
+    <w:rsid w:val="003D2706"/>
     <w:rPr>
       <w:i/>
       <w:iCs/>
@@ -2818,7 +2879,7 @@
     <w:link w:val="IntenseQuoteChar"/>
     <w:uiPriority w:val="30"/>
     <w:qFormat/>
-    <w:rsid w:val="00226699"/>
+    <w:rsid w:val="003D2706"/>
     <w:pPr>
       <w:pBdr>
         <w:top w:val="single" w:sz="4" w:space="10" w:color="0F4761" w:themeColor="accent1" w:themeShade="BF"/>
@@ -2839,7 +2900,7 @@
     <w:basedOn w:val="DefaultParagraphFont"/>
     <w:link w:val="IntenseQuote"/>
     <w:uiPriority w:val="30"/>
-    <w:rsid w:val="00226699"/>
+    <w:rsid w:val="003D2706"/>
     <w:rPr>
       <w:i/>
       <w:iCs/>
@@ -2851,7 +2912,7 @@
     <w:basedOn w:val="DefaultParagraphFont"/>
     <w:uiPriority w:val="32"/>
     <w:qFormat/>
-    <w:rsid w:val="00226699"/>
+    <w:rsid w:val="003D2706"/>
     <w:rPr>
       <w:b/>
       <w:bCs/>
@@ -2865,7 +2926,7 @@
     <w:basedOn w:val="Normal"/>
     <w:uiPriority w:val="99"/>
     <w:unhideWhenUsed/>
-    <w:rsid w:val="00226699"/>
+    <w:rsid w:val="003D2706"/>
     <w:pPr>
       <w:numPr>
         <w:numId w:val="1"/>

</xml_diff>